<commit_message>
lab10: finished exercise 1 & 2
</commit_message>
<xml_diff>
--- a/lab10/lab10_report.docx
+++ b/lab10/lab10_report.docx
@@ -164,6 +164,197 @@
     </w:p>
     <w:p>
       <w:pPr>
+        <w:rPr>
+          <w:rFonts w:ascii="Times New Roman" w:eastAsiaTheme="majorEastAsia" w:hAnsi="Times New Roman" w:cs="Times New Roman"/>
+          <w:kern w:val="0"/>
+          <w:sz w:val="32"/>
+          <w:szCs w:val="32"/>
+          <w:lang w:val="en-GB" w:eastAsia="nb-NO"/>
+          <w14:ligatures w14:val="none"/>
+        </w:rPr>
+      </w:pPr>
+      <w:r>
+        <w:rPr>
+          <w:rFonts w:ascii="Times New Roman" w:eastAsiaTheme="majorEastAsia" w:hAnsi="Times New Roman" w:cs="Times New Roman"/>
+          <w:kern w:val="0"/>
+          <w:sz w:val="32"/>
+          <w:szCs w:val="32"/>
+          <w:lang w:val="en-GB" w:eastAsia="nb-NO"/>
+          <w14:ligatures w14:val="none"/>
+        </w:rPr>
+        <w:br w:type="page"/>
+      </w:r>
+    </w:p>
+    <w:p>
+      <w:pPr>
+        <w:rPr>
+          <w:rFonts w:ascii="Times New Roman" w:hAnsi="Times New Roman" w:cs="Times New Roman"/>
+          <w:b/>
+          <w:bCs/>
+          <w:sz w:val="28"/>
+          <w:szCs w:val="28"/>
+          <w:lang w:val="en-GB" w:eastAsia="nb-NO"/>
+        </w:rPr>
+      </w:pPr>
+      <w:r>
+        <w:rPr>
+          <w:rFonts w:ascii="Times New Roman" w:hAnsi="Times New Roman" w:cs="Times New Roman"/>
+          <w:b/>
+          <w:bCs/>
+          <w:sz w:val="28"/>
+          <w:szCs w:val="28"/>
+          <w:lang w:val="en-GB" w:eastAsia="nb-NO"/>
+        </w:rPr>
+        <w:lastRenderedPageBreak/>
+        <w:t>Disclaimer:</w:t>
+      </w:r>
+    </w:p>
+    <w:p>
+      <w:pPr>
+        <w:rPr>
+          <w:rFonts w:ascii="Times New Roman" w:hAnsi="Times New Roman" w:cs="Times New Roman"/>
+          <w:lang w:val="en-GB" w:eastAsia="nb-NO"/>
+        </w:rPr>
+      </w:pPr>
+      <w:r>
+        <w:rPr>
+          <w:rFonts w:ascii="Times New Roman" w:hAnsi="Times New Roman" w:cs="Times New Roman"/>
+          <w:lang w:val="en-GB" w:eastAsia="nb-NO"/>
+        </w:rPr>
+        <w:t xml:space="preserve">I used Visual Studio Code </w:t>
+      </w:r>
+      <w:r>
+        <w:rPr>
+          <w:rFonts w:ascii="Times New Roman" w:hAnsi="Times New Roman" w:cs="Times New Roman"/>
+          <w:lang w:val="en-GB" w:eastAsia="nb-NO"/>
+        </w:rPr>
+        <w:t xml:space="preserve">on Mac </w:t>
+      </w:r>
+      <w:r>
+        <w:rPr>
+          <w:rFonts w:ascii="Times New Roman" w:hAnsi="Times New Roman" w:cs="Times New Roman"/>
+          <w:lang w:val="en-GB" w:eastAsia="nb-NO"/>
+        </w:rPr>
+        <w:t xml:space="preserve">to solve this </w:t>
+      </w:r>
+      <w:r>
+        <w:rPr>
+          <w:rFonts w:ascii="Times New Roman" w:hAnsi="Times New Roman" w:cs="Times New Roman"/>
+          <w:lang w:val="en-GB" w:eastAsia="nb-NO"/>
+        </w:rPr>
+        <w:t>lab, and I could therefore not follow the provided guide</w:t>
+      </w:r>
+      <w:r>
+        <w:rPr>
+          <w:rFonts w:ascii="Times New Roman" w:hAnsi="Times New Roman" w:cs="Times New Roman"/>
+          <w:lang w:val="en-GB" w:eastAsia="nb-NO"/>
+        </w:rPr>
+        <w:t>s</w:t>
+      </w:r>
+      <w:r>
+        <w:rPr>
+          <w:rFonts w:ascii="Times New Roman" w:hAnsi="Times New Roman" w:cs="Times New Roman"/>
+          <w:lang w:val="en-GB" w:eastAsia="nb-NO"/>
+        </w:rPr>
+        <w:t xml:space="preserve"> in the PDF. The way I did it was asking Claude to generate some scripts to make this work for me, with instructions. </w:t>
+      </w:r>
+    </w:p>
+    <w:p>
+      <w:pPr>
+        <w:rPr>
+          <w:rFonts w:ascii="Times New Roman" w:hAnsi="Times New Roman" w:cs="Times New Roman"/>
+          <w:lang w:val="en-GB" w:eastAsia="nb-NO"/>
+        </w:rPr>
+      </w:pPr>
+      <w:r>
+        <w:rPr>
+          <w:rFonts w:ascii="Times New Roman" w:hAnsi="Times New Roman" w:cs="Times New Roman"/>
+          <w:lang w:val="en-GB" w:eastAsia="nb-NO"/>
+        </w:rPr>
+        <w:t>I will ther</w:t>
+      </w:r>
+      <w:r>
+        <w:rPr>
+          <w:rFonts w:ascii="Times New Roman" w:hAnsi="Times New Roman" w:cs="Times New Roman"/>
+          <w:lang w:val="en-GB" w:eastAsia="nb-NO"/>
+        </w:rPr>
+        <w:t>e</w:t>
+      </w:r>
+      <w:r>
+        <w:rPr>
+          <w:rFonts w:ascii="Times New Roman" w:hAnsi="Times New Roman" w:cs="Times New Roman"/>
+          <w:lang w:val="en-GB" w:eastAsia="nb-NO"/>
+        </w:rPr>
+        <w:t xml:space="preserve">fore commit a folder called </w:t>
+      </w:r>
+      <w:r>
+        <w:rPr>
+          <w:rFonts w:ascii="Times New Roman" w:hAnsi="Times New Roman" w:cs="Times New Roman"/>
+          <w:i/>
+          <w:iCs/>
+          <w:lang w:val="en-GB" w:eastAsia="nb-NO"/>
+        </w:rPr>
+        <w:t>scripts</w:t>
+      </w:r>
+      <w:r>
+        <w:rPr>
+          <w:rFonts w:ascii="Times New Roman" w:hAnsi="Times New Roman" w:cs="Times New Roman"/>
+          <w:lang w:val="en-GB" w:eastAsia="nb-NO"/>
+        </w:rPr>
+        <w:t xml:space="preserve"> which includes some setup, running and compiling- scripts for running the provided code. </w:t>
+      </w:r>
+    </w:p>
+    <w:p>
+      <w:pPr>
+        <w:rPr>
+          <w:rFonts w:ascii="Times New Roman" w:hAnsi="Times New Roman" w:cs="Times New Roman"/>
+          <w:lang w:val="en-GB" w:eastAsia="nb-NO"/>
+        </w:rPr>
+      </w:pPr>
+      <w:r>
+        <w:rPr>
+          <w:rFonts w:ascii="Times New Roman" w:hAnsi="Times New Roman" w:cs="Times New Roman"/>
+          <w:lang w:val="en-GB" w:eastAsia="nb-NO"/>
+        </w:rPr>
+        <w:t xml:space="preserve">If interested, a README is provided at root level in </w:t>
+      </w:r>
+      <w:r>
+        <w:rPr>
+          <w:rFonts w:ascii="Times New Roman" w:hAnsi="Times New Roman" w:cs="Times New Roman"/>
+          <w:i/>
+          <w:iCs/>
+          <w:lang w:val="en-GB" w:eastAsia="nb-NO"/>
+        </w:rPr>
+        <w:t>untitled</w:t>
+      </w:r>
+      <w:r>
+        <w:rPr>
+          <w:rFonts w:ascii="Times New Roman" w:hAnsi="Times New Roman" w:cs="Times New Roman"/>
+          <w:lang w:val="en-GB" w:eastAsia="nb-NO"/>
+        </w:rPr>
+        <w:t>, explaining how to use the scripts.</w:t>
+      </w:r>
+    </w:p>
+    <w:p>
+      <w:pPr>
+        <w:keepNext/>
+        <w:keepLines/>
+        <w:spacing w:before="360" w:after="120" w:line="360" w:lineRule="auto"/>
+        <w:ind w:right="360"/>
+        <w:jc w:val="center"/>
+        <w:outlineLvl w:val="0"/>
+        <w:rPr>
+          <w:rFonts w:ascii="Times New Roman" w:eastAsiaTheme="majorEastAsia" w:hAnsi="Times New Roman" w:cs="Times New Roman"/>
+          <w:kern w:val="0"/>
+          <w:sz w:val="32"/>
+          <w:szCs w:val="32"/>
+          <w:lang w:val="en-GB" w:eastAsia="nb-NO"/>
+          <w14:ligatures w14:val="none"/>
+        </w:rPr>
+      </w:pPr>
+    </w:p>
+    <w:p>
+      <w:pPr>
         <w:spacing w:line="360" w:lineRule="auto"/>
         <w:rPr>
           <w:rFonts w:ascii="Times New Roman" w:eastAsiaTheme="majorEastAsia" w:hAnsi="Times New Roman" w:cs="Times New Roman"/>
@@ -249,12 +440,16 @@
       <w:pPr>
         <w:rPr>
           <w:rFonts w:ascii="Times New Roman" w:hAnsi="Times New Roman" w:cs="Times New Roman"/>
-          <w:lang w:val="en-GB" w:eastAsia="nb-NO"/>
-        </w:rPr>
-      </w:pPr>
-      <w:r>
-        <w:rPr>
-          <w:rFonts w:ascii="Times New Roman" w:hAnsi="Times New Roman" w:cs="Times New Roman"/>
+          <w:bCs/>
+          <w:u w:val="single"/>
+          <w:lang w:val="en-GB" w:eastAsia="nb-NO"/>
+        </w:rPr>
+      </w:pPr>
+      <w:r>
+        <w:rPr>
+          <w:rFonts w:ascii="Times New Roman" w:hAnsi="Times New Roman" w:cs="Times New Roman"/>
+          <w:bCs/>
+          <w:u w:val="single"/>
           <w:lang w:val="en-GB" w:eastAsia="nb-NO"/>
         </w:rPr>
         <w:t>Subtask 1:</w:t>
@@ -262,21 +457,202 @@
       <w:r>
         <w:rPr>
           <w:rFonts w:ascii="Times New Roman" w:hAnsi="Times New Roman" w:cs="Times New Roman"/>
-          <w:lang w:val="en-GB" w:eastAsia="nb-NO"/>
-        </w:rPr>
-        <w:t xml:space="preserve"> Run code multiple times and include screenshots</w:t>
+          <w:bCs/>
+          <w:u w:val="single"/>
+          <w:lang w:val="en-GB" w:eastAsia="nb-NO"/>
+        </w:rPr>
+        <w:t xml:space="preserve"> Run code multiple times</w:t>
+      </w:r>
+      <w:r>
+        <w:rPr>
+          <w:rFonts w:ascii="Times New Roman" w:hAnsi="Times New Roman" w:cs="Times New Roman"/>
+          <w:bCs/>
+          <w:u w:val="single"/>
+          <w:lang w:val="en-GB" w:eastAsia="nb-NO"/>
+        </w:rPr>
+        <w:t xml:space="preserve"> with different processes</w:t>
+      </w:r>
+      <w:r>
+        <w:rPr>
+          <w:rFonts w:ascii="Times New Roman" w:hAnsi="Times New Roman" w:cs="Times New Roman"/>
+          <w:bCs/>
+          <w:u w:val="single"/>
+          <w:lang w:val="en-GB" w:eastAsia="nb-NO"/>
+        </w:rPr>
+        <w:t xml:space="preserve"> and include screenshots</w:t>
       </w:r>
     </w:p>
     <w:p>
       <w:pPr>
-        <w:rPr>
-          <w:rFonts w:ascii="Times New Roman" w:hAnsi="Times New Roman" w:cs="Times New Roman"/>
-          <w:lang w:val="en-GB" w:eastAsia="nb-NO"/>
-        </w:rPr>
-      </w:pPr>
-      <w:r>
-        <w:rPr>
-          <w:rFonts w:ascii="Times New Roman" w:hAnsi="Times New Roman" w:cs="Times New Roman"/>
+        <w:ind w:left="708" w:hanging="708"/>
+        <w:rPr>
+          <w:rFonts w:ascii="Times New Roman" w:hAnsi="Times New Roman" w:cs="Times New Roman"/>
+          <w:lang w:val="en-GB" w:eastAsia="nb-NO"/>
+        </w:rPr>
+      </w:pPr>
+      <w:r>
+        <w:rPr>
+          <w:rFonts w:ascii="Times New Roman" w:hAnsi="Times New Roman" w:cs="Times New Roman"/>
+          <w:lang w:val="en-GB" w:eastAsia="nb-NO"/>
+        </w:rPr>
+        <w:drawing>
+          <wp:inline distT="0" distB="0" distL="0" distR="0" wp14:anchorId="1960982B" wp14:editId="2E3C0108">
+            <wp:extent cx="5760720" cy="1908175"/>
+            <wp:effectExtent l="0" t="0" r="5080" b="0"/>
+            <wp:docPr id="315000833" name="Bilde 1"/>
+            <wp:cNvGraphicFramePr>
+              <a:graphicFrameLocks xmlns:a="http://schemas.openxmlformats.org/drawingml/2006/main" noChangeAspect="1"/>
+            </wp:cNvGraphicFramePr>
+            <a:graphic xmlns:a="http://schemas.openxmlformats.org/drawingml/2006/main">
+              <a:graphicData uri="http://schemas.openxmlformats.org/drawingml/2006/picture">
+                <pic:pic xmlns:pic="http://schemas.openxmlformats.org/drawingml/2006/picture">
+                  <pic:nvPicPr>
+                    <pic:cNvPr id="315000833" name=""/>
+                    <pic:cNvPicPr/>
+                  </pic:nvPicPr>
+                  <pic:blipFill>
+                    <a:blip r:embed="rId7"/>
+                    <a:stretch>
+                      <a:fillRect/>
+                    </a:stretch>
+                  </pic:blipFill>
+                  <pic:spPr>
+                    <a:xfrm>
+                      <a:off x="0" y="0"/>
+                      <a:ext cx="5760720" cy="1908175"/>
+                    </a:xfrm>
+                    <a:prstGeom prst="rect">
+                      <a:avLst/>
+                    </a:prstGeom>
+                  </pic:spPr>
+                </pic:pic>
+              </a:graphicData>
+            </a:graphic>
+          </wp:inline>
+        </w:drawing>
+      </w:r>
+    </w:p>
+    <w:p>
+      <w:pPr>
+        <w:ind w:left="708" w:hanging="708"/>
+        <w:rPr>
+          <w:rFonts w:ascii="Times New Roman" w:hAnsi="Times New Roman" w:cs="Times New Roman"/>
+          <w:lang w:val="en-GB" w:eastAsia="nb-NO"/>
+        </w:rPr>
+      </w:pPr>
+      <w:r>
+        <w:rPr>
+          <w:rFonts w:ascii="Times New Roman" w:hAnsi="Times New Roman" w:cs="Times New Roman"/>
+          <w:lang w:val="en-GB" w:eastAsia="nb-NO"/>
+        </w:rPr>
+        <w:drawing>
+          <wp:inline distT="0" distB="0" distL="0" distR="0" wp14:anchorId="38BA9CFC" wp14:editId="19011DBA">
+            <wp:extent cx="5760720" cy="2505075"/>
+            <wp:effectExtent l="0" t="0" r="5080" b="0"/>
+            <wp:docPr id="2091166108" name="Bilde 1"/>
+            <wp:cNvGraphicFramePr>
+              <a:graphicFrameLocks xmlns:a="http://schemas.openxmlformats.org/drawingml/2006/main" noChangeAspect="1"/>
+            </wp:cNvGraphicFramePr>
+            <a:graphic xmlns:a="http://schemas.openxmlformats.org/drawingml/2006/main">
+              <a:graphicData uri="http://schemas.openxmlformats.org/drawingml/2006/picture">
+                <pic:pic xmlns:pic="http://schemas.openxmlformats.org/drawingml/2006/picture">
+                  <pic:nvPicPr>
+                    <pic:cNvPr id="2091166108" name=""/>
+                    <pic:cNvPicPr/>
+                  </pic:nvPicPr>
+                  <pic:blipFill>
+                    <a:blip r:embed="rId8"/>
+                    <a:stretch>
+                      <a:fillRect/>
+                    </a:stretch>
+                  </pic:blipFill>
+                  <pic:spPr>
+                    <a:xfrm>
+                      <a:off x="0" y="0"/>
+                      <a:ext cx="5760720" cy="2505075"/>
+                    </a:xfrm>
+                    <a:prstGeom prst="rect">
+                      <a:avLst/>
+                    </a:prstGeom>
+                  </pic:spPr>
+                </pic:pic>
+              </a:graphicData>
+            </a:graphic>
+          </wp:inline>
+        </w:drawing>
+      </w:r>
+    </w:p>
+    <w:p>
+      <w:pPr>
+        <w:ind w:left="708" w:hanging="708"/>
+        <w:rPr>
+          <w:rFonts w:ascii="Times New Roman" w:hAnsi="Times New Roman" w:cs="Times New Roman"/>
+          <w:lang w:val="en-GB" w:eastAsia="nb-NO"/>
+        </w:rPr>
+      </w:pPr>
+      <w:r>
+        <w:rPr>
+          <w:rFonts w:ascii="Times New Roman" w:hAnsi="Times New Roman" w:cs="Times New Roman"/>
+          <w:lang w:val="en-GB" w:eastAsia="nb-NO"/>
+        </w:rPr>
+        <w:drawing>
+          <wp:inline distT="0" distB="0" distL="0" distR="0" wp14:anchorId="55012C85" wp14:editId="3934A805">
+            <wp:extent cx="5760720" cy="3177540"/>
+            <wp:effectExtent l="0" t="0" r="5080" b="0"/>
+            <wp:docPr id="2082841615" name="Bilde 1"/>
+            <wp:cNvGraphicFramePr>
+              <a:graphicFrameLocks xmlns:a="http://schemas.openxmlformats.org/drawingml/2006/main" noChangeAspect="1"/>
+            </wp:cNvGraphicFramePr>
+            <a:graphic xmlns:a="http://schemas.openxmlformats.org/drawingml/2006/main">
+              <a:graphicData uri="http://schemas.openxmlformats.org/drawingml/2006/picture">
+                <pic:pic xmlns:pic="http://schemas.openxmlformats.org/drawingml/2006/picture">
+                  <pic:nvPicPr>
+                    <pic:cNvPr id="2082841615" name=""/>
+                    <pic:cNvPicPr/>
+                  </pic:nvPicPr>
+                  <pic:blipFill>
+                    <a:blip r:embed="rId9"/>
+                    <a:stretch>
+                      <a:fillRect/>
+                    </a:stretch>
+                  </pic:blipFill>
+                  <pic:spPr>
+                    <a:xfrm>
+                      <a:off x="0" y="0"/>
+                      <a:ext cx="5760720" cy="3177540"/>
+                    </a:xfrm>
+                    <a:prstGeom prst="rect">
+                      <a:avLst/>
+                    </a:prstGeom>
+                  </pic:spPr>
+                </pic:pic>
+              </a:graphicData>
+            </a:graphic>
+          </wp:inline>
+        </w:drawing>
+      </w:r>
+    </w:p>
+    <w:p>
+      <w:pPr>
+        <w:ind w:left="708" w:hanging="708"/>
+        <w:rPr>
+          <w:rFonts w:ascii="Times New Roman" w:hAnsi="Times New Roman" w:cs="Times New Roman"/>
+          <w:lang w:val="en-GB" w:eastAsia="nb-NO"/>
+        </w:rPr>
+      </w:pPr>
+    </w:p>
+    <w:p>
+      <w:pPr>
+        <w:rPr>
+          <w:rFonts w:ascii="Times New Roman" w:hAnsi="Times New Roman" w:cs="Times New Roman"/>
+          <w:u w:val="single"/>
+          <w:lang w:val="en-GB" w:eastAsia="nb-NO"/>
+        </w:rPr>
+      </w:pPr>
+      <w:r>
+        <w:rPr>
+          <w:rFonts w:ascii="Times New Roman" w:hAnsi="Times New Roman" w:cs="Times New Roman"/>
+          <w:u w:val="single"/>
           <w:lang w:val="en-GB" w:eastAsia="nb-NO"/>
         </w:rPr>
         <w:t>Subtask 2:</w:t>
@@ -284,9 +660,89 @@
       <w:r>
         <w:rPr>
           <w:rFonts w:ascii="Times New Roman" w:hAnsi="Times New Roman" w:cs="Times New Roman"/>
+          <w:u w:val="single"/>
           <w:lang w:val="en-GB" w:eastAsia="nb-NO"/>
         </w:rPr>
         <w:t xml:space="preserve"> Multicore or cluster?</w:t>
+      </w:r>
+    </w:p>
+    <w:p>
+      <w:pPr>
+        <w:pStyle w:val="Listeavsnitt"/>
+        <w:numPr>
+          <w:ilvl w:val="0"/>
+          <w:numId w:val="20"/>
+        </w:numPr>
+        <w:rPr>
+          <w:rFonts w:ascii="Times New Roman" w:hAnsi="Times New Roman" w:cs="Times New Roman"/>
+          <w:lang w:val="en-GB" w:eastAsia="nb-NO"/>
+        </w:rPr>
+      </w:pPr>
+      <w:r>
+        <w:rPr>
+          <w:rFonts w:ascii="Times New Roman" w:hAnsi="Times New Roman" w:cs="Times New Roman"/>
+          <w:lang w:val="en-GB" w:eastAsia="nb-NO"/>
+        </w:rPr>
+        <w:t>The program is currently running in multicore configuration, as shown in the output</w:t>
+      </w:r>
+      <w:r>
+        <w:rPr>
+          <w:rFonts w:ascii="Times New Roman" w:hAnsi="Times New Roman" w:cs="Times New Roman"/>
+          <w:lang w:val="en-GB" w:eastAsia="nb-NO"/>
+        </w:rPr>
+        <w:t xml:space="preserve"> in subtask 1. </w:t>
+      </w:r>
+    </w:p>
+    <w:p>
+      <w:pPr>
+        <w:pStyle w:val="Listeavsnitt"/>
+        <w:numPr>
+          <w:ilvl w:val="0"/>
+          <w:numId w:val="20"/>
+        </w:numPr>
+        <w:rPr>
+          <w:rFonts w:ascii="Times New Roman" w:hAnsi="Times New Roman" w:cs="Times New Roman"/>
+          <w:lang w:val="en-GB" w:eastAsia="nb-NO"/>
+        </w:rPr>
+      </w:pPr>
+      <w:r>
+        <w:rPr>
+          <w:rFonts w:ascii="Times New Roman" w:hAnsi="Times New Roman" w:cs="Times New Roman"/>
+          <w:lang w:val="en-GB" w:eastAsia="nb-NO"/>
+        </w:rPr>
+        <w:t xml:space="preserve">This is </w:t>
+      </w:r>
+      <w:proofErr w:type="spellStart"/>
+      <w:r>
+        <w:rPr>
+          <w:rFonts w:ascii="Times New Roman" w:hAnsi="Times New Roman" w:cs="Times New Roman"/>
+          <w:lang w:val="en-GB" w:eastAsia="nb-NO"/>
+        </w:rPr>
+        <w:t>MPJ</w:t>
+      </w:r>
+      <w:proofErr w:type="spellEnd"/>
+      <w:r>
+        <w:rPr>
+          <w:rFonts w:ascii="Times New Roman" w:hAnsi="Times New Roman" w:cs="Times New Roman"/>
+          <w:lang w:val="en-GB" w:eastAsia="nb-NO"/>
+        </w:rPr>
+        <w:t xml:space="preserve"> Express's default mode when you don't specify a device. It simulates </w:t>
+      </w:r>
+      <w:proofErr w:type="spellStart"/>
+      <w:r>
+        <w:rPr>
+          <w:rFonts w:ascii="Times New Roman" w:hAnsi="Times New Roman" w:cs="Times New Roman"/>
+          <w:lang w:val="en-GB" w:eastAsia="nb-NO"/>
+        </w:rPr>
+        <w:t>MPI</w:t>
+      </w:r>
+      <w:proofErr w:type="spellEnd"/>
+      <w:r>
+        <w:rPr>
+          <w:rFonts w:ascii="Times New Roman" w:hAnsi="Times New Roman" w:cs="Times New Roman"/>
+          <w:lang w:val="en-GB" w:eastAsia="nb-NO"/>
+        </w:rPr>
+        <w:t xml:space="preserve"> on a single machine by launching multiple local processes.</w:t>
       </w:r>
     </w:p>
     <w:p>
@@ -338,12 +794,14 @@
       <w:pPr>
         <w:rPr>
           <w:rFonts w:ascii="Times New Roman" w:hAnsi="Times New Roman" w:cs="Times New Roman"/>
-          <w:lang w:val="en-GB" w:eastAsia="nb-NO"/>
-        </w:rPr>
-      </w:pPr>
-      <w:r>
-        <w:rPr>
-          <w:rFonts w:ascii="Times New Roman" w:hAnsi="Times New Roman" w:cs="Times New Roman"/>
+          <w:u w:val="single"/>
+          <w:lang w:val="en-GB" w:eastAsia="nb-NO"/>
+        </w:rPr>
+      </w:pPr>
+      <w:r>
+        <w:rPr>
+          <w:rFonts w:ascii="Times New Roman" w:hAnsi="Times New Roman" w:cs="Times New Roman"/>
+          <w:u w:val="single"/>
           <w:lang w:val="en-GB" w:eastAsia="nb-NO"/>
         </w:rPr>
         <w:t>Subtask 1:</w:t>
@@ -351,6 +809,7 @@
       <w:r>
         <w:rPr>
           <w:rFonts w:ascii="Times New Roman" w:hAnsi="Times New Roman" w:cs="Times New Roman"/>
+          <w:u w:val="single"/>
           <w:lang w:val="en-GB" w:eastAsia="nb-NO"/>
         </w:rPr>
         <w:t xml:space="preserve"> Run code and include screenshots</w:t>
@@ -358,14 +817,70 @@
     </w:p>
     <w:p>
       <w:pPr>
-        <w:rPr>
-          <w:rFonts w:ascii="Times New Roman" w:hAnsi="Times New Roman" w:cs="Times New Roman"/>
-          <w:lang w:val="en-GB" w:eastAsia="nb-NO"/>
-        </w:rPr>
-      </w:pPr>
-      <w:r>
-        <w:rPr>
-          <w:rFonts w:ascii="Times New Roman" w:hAnsi="Times New Roman" w:cs="Times New Roman"/>
+        <w:pStyle w:val="Listeavsnitt"/>
+        <w:numPr>
+          <w:ilvl w:val="0"/>
+          <w:numId w:val="20"/>
+        </w:numPr>
+        <w:rPr>
+          <w:rFonts w:ascii="Times New Roman" w:hAnsi="Times New Roman" w:cs="Times New Roman"/>
+          <w:lang w:val="en-GB" w:eastAsia="nb-NO"/>
+        </w:rPr>
+      </w:pPr>
+      <w:r>
+        <w:rPr>
+          <w:rFonts w:ascii="Times New Roman" w:hAnsi="Times New Roman" w:cs="Times New Roman"/>
+          <w:lang w:val="en-GB" w:eastAsia="nb-NO"/>
+        </w:rPr>
+        <w:drawing>
+          <wp:inline distT="0" distB="0" distL="0" distR="0" wp14:anchorId="3BD1B0FB" wp14:editId="5FC91490">
+            <wp:extent cx="3374336" cy="4883711"/>
+            <wp:effectExtent l="0" t="0" r="4445" b="0"/>
+            <wp:docPr id="212415886" name="Bilde 1"/>
+            <wp:cNvGraphicFramePr>
+              <a:graphicFrameLocks xmlns:a="http://schemas.openxmlformats.org/drawingml/2006/main" noChangeAspect="1"/>
+            </wp:cNvGraphicFramePr>
+            <a:graphic xmlns:a="http://schemas.openxmlformats.org/drawingml/2006/main">
+              <a:graphicData uri="http://schemas.openxmlformats.org/drawingml/2006/picture">
+                <pic:pic xmlns:pic="http://schemas.openxmlformats.org/drawingml/2006/picture">
+                  <pic:nvPicPr>
+                    <pic:cNvPr id="212415886" name=""/>
+                    <pic:cNvPicPr/>
+                  </pic:nvPicPr>
+                  <pic:blipFill>
+                    <a:blip r:embed="rId10"/>
+                    <a:stretch>
+                      <a:fillRect/>
+                    </a:stretch>
+                  </pic:blipFill>
+                  <pic:spPr>
+                    <a:xfrm>
+                      <a:off x="0" y="0"/>
+                      <a:ext cx="3441108" cy="4980352"/>
+                    </a:xfrm>
+                    <a:prstGeom prst="rect">
+                      <a:avLst/>
+                    </a:prstGeom>
+                  </pic:spPr>
+                </pic:pic>
+              </a:graphicData>
+            </a:graphic>
+          </wp:inline>
+        </w:drawing>
+      </w:r>
+    </w:p>
+    <w:p>
+      <w:pPr>
+        <w:rPr>
+          <w:rFonts w:ascii="Times New Roman" w:hAnsi="Times New Roman" w:cs="Times New Roman"/>
+          <w:u w:val="single"/>
+          <w:lang w:val="en-GB" w:eastAsia="nb-NO"/>
+        </w:rPr>
+      </w:pPr>
+      <w:r>
+        <w:rPr>
+          <w:rFonts w:ascii="Times New Roman" w:hAnsi="Times New Roman" w:cs="Times New Roman"/>
+          <w:u w:val="single"/>
           <w:lang w:val="en-GB" w:eastAsia="nb-NO"/>
         </w:rPr>
         <w:t>Subtask 2:</w:t>
@@ -373,10 +888,235 @@
       <w:r>
         <w:rPr>
           <w:rFonts w:ascii="Times New Roman" w:hAnsi="Times New Roman" w:cs="Times New Roman"/>
-          <w:lang w:val="en-GB" w:eastAsia="nb-NO"/>
-        </w:rPr>
-        <w:t xml:space="preserve"> Run code and include screenshots</w:t>
-      </w:r>
+          <w:u w:val="single"/>
+          <w:lang w:val="en-GB" w:eastAsia="nb-NO"/>
+        </w:rPr>
+        <w:t xml:space="preserve"> </w:t>
+      </w:r>
+      <w:r>
+        <w:rPr>
+          <w:rFonts w:ascii="Times New Roman" w:hAnsi="Times New Roman" w:cs="Times New Roman"/>
+          <w:u w:val="single"/>
+          <w:lang w:val="en-GB" w:eastAsia="nb-NO"/>
+        </w:rPr>
+        <w:t xml:space="preserve">Modify and run program, </w:t>
+      </w:r>
+      <w:r>
+        <w:rPr>
+          <w:rFonts w:ascii="Times New Roman" w:hAnsi="Times New Roman" w:cs="Times New Roman"/>
+          <w:u w:val="single"/>
+          <w:lang w:val="en-GB" w:eastAsia="nb-NO"/>
+        </w:rPr>
+        <w:t>and include screenshots</w:t>
+      </w:r>
+    </w:p>
+    <w:p>
+      <w:pPr>
+        <w:rPr>
+          <w:rFonts w:ascii="Times New Roman" w:hAnsi="Times New Roman" w:cs="Times New Roman"/>
+          <w:u w:val="single"/>
+          <w:lang w:val="en-GB" w:eastAsia="nb-NO"/>
+        </w:rPr>
+      </w:pPr>
+      <w:r>
+        <w:rPr>
+          <w:rFonts w:ascii="Times New Roman" w:hAnsi="Times New Roman" w:cs="Times New Roman"/>
+          <w:u w:val="single"/>
+          <w:lang w:val="en-GB" w:eastAsia="nb-NO"/>
+        </w:rPr>
+        <w:lastRenderedPageBreak/>
+        <w:drawing>
+          <wp:inline distT="0" distB="0" distL="0" distR="0" wp14:anchorId="6B15EF4B" wp14:editId="66332C29">
+            <wp:extent cx="5760720" cy="3113405"/>
+            <wp:effectExtent l="0" t="0" r="5080" b="0"/>
+            <wp:docPr id="1877614807" name="Bilde 1"/>
+            <wp:cNvGraphicFramePr>
+              <a:graphicFrameLocks xmlns:a="http://schemas.openxmlformats.org/drawingml/2006/main" noChangeAspect="1"/>
+            </wp:cNvGraphicFramePr>
+            <a:graphic xmlns:a="http://schemas.openxmlformats.org/drawingml/2006/main">
+              <a:graphicData uri="http://schemas.openxmlformats.org/drawingml/2006/picture">
+                <pic:pic xmlns:pic="http://schemas.openxmlformats.org/drawingml/2006/picture">
+                  <pic:nvPicPr>
+                    <pic:cNvPr id="1877614807" name=""/>
+                    <pic:cNvPicPr/>
+                  </pic:nvPicPr>
+                  <pic:blipFill>
+                    <a:blip r:embed="rId11"/>
+                    <a:stretch>
+                      <a:fillRect/>
+                    </a:stretch>
+                  </pic:blipFill>
+                  <pic:spPr>
+                    <a:xfrm>
+                      <a:off x="0" y="0"/>
+                      <a:ext cx="5760720" cy="3113405"/>
+                    </a:xfrm>
+                    <a:prstGeom prst="rect">
+                      <a:avLst/>
+                    </a:prstGeom>
+                  </pic:spPr>
+                </pic:pic>
+              </a:graphicData>
+            </a:graphic>
+          </wp:inline>
+        </w:drawing>
+      </w:r>
+    </w:p>
+    <w:p>
+      <w:pPr>
+        <w:pStyle w:val="Listeavsnitt"/>
+        <w:numPr>
+          <w:ilvl w:val="0"/>
+          <w:numId w:val="20"/>
+        </w:numPr>
+        <w:rPr>
+          <w:rFonts w:ascii="Times New Roman" w:hAnsi="Times New Roman" w:cs="Times New Roman"/>
+          <w:lang w:val="en-GB" w:eastAsia="nb-NO"/>
+        </w:rPr>
+      </w:pPr>
+      <w:r>
+        <w:rPr>
+          <w:rFonts w:ascii="Times New Roman" w:hAnsi="Times New Roman" w:cs="Times New Roman"/>
+          <w:b/>
+          <w:bCs/>
+          <w:lang w:val="en-GB" w:eastAsia="nb-NO"/>
+        </w:rPr>
+        <w:t>Before</w:t>
+      </w:r>
+      <w:r>
+        <w:rPr>
+          <w:rFonts w:ascii="Times New Roman" w:hAnsi="Times New Roman" w:cs="Times New Roman"/>
+          <w:lang w:val="en-GB" w:eastAsia="nb-NO"/>
+        </w:rPr>
+        <w:t>: The program sent 21 messages in a back-and-forth pattern (Process 0 sends, then receives in the same loop).</w:t>
+      </w:r>
+    </w:p>
+    <w:p>
+      <w:pPr>
+        <w:pStyle w:val="Listeavsnitt"/>
+        <w:numPr>
+          <w:ilvl w:val="0"/>
+          <w:numId w:val="20"/>
+        </w:numPr>
+        <w:rPr>
+          <w:rFonts w:ascii="Times New Roman" w:hAnsi="Times New Roman" w:cs="Times New Roman"/>
+          <w:lang w:val="en-GB" w:eastAsia="nb-NO"/>
+        </w:rPr>
+      </w:pPr>
+      <w:r>
+        <w:rPr>
+          <w:rFonts w:ascii="Times New Roman" w:hAnsi="Times New Roman" w:cs="Times New Roman"/>
+          <w:b/>
+          <w:bCs/>
+          <w:lang w:val="en-GB" w:eastAsia="nb-NO"/>
+        </w:rPr>
+        <w:t>After</w:t>
+      </w:r>
+      <w:r>
+        <w:rPr>
+          <w:rFonts w:ascii="Times New Roman" w:hAnsi="Times New Roman" w:cs="Times New Roman"/>
+          <w:lang w:val="en-GB" w:eastAsia="nb-NO"/>
+        </w:rPr>
+        <w:t>:</w:t>
+      </w:r>
+      <w:r>
+        <w:rPr>
+          <w:rFonts w:ascii="Times New Roman" w:hAnsi="Times New Roman" w:cs="Times New Roman"/>
+          <w:b/>
+          <w:bCs/>
+          <w:lang w:val="en-GB" w:eastAsia="nb-NO"/>
+        </w:rPr>
+        <w:t xml:space="preserve"> </w:t>
+      </w:r>
+    </w:p>
+    <w:p>
+      <w:pPr>
+        <w:pStyle w:val="Listeavsnitt"/>
+        <w:numPr>
+          <w:ilvl w:val="1"/>
+          <w:numId w:val="20"/>
+        </w:numPr>
+        <w:rPr>
+          <w:rFonts w:ascii="Times New Roman" w:hAnsi="Times New Roman" w:cs="Times New Roman"/>
+          <w:lang w:val="en-GB" w:eastAsia="nb-NO"/>
+        </w:rPr>
+      </w:pPr>
+      <w:r>
+        <w:rPr>
+          <w:rFonts w:ascii="Times New Roman" w:hAnsi="Times New Roman" w:cs="Times New Roman"/>
+          <w:lang w:val="en-GB" w:eastAsia="nb-NO"/>
+        </w:rPr>
+        <w:t>Send 5 clearly numbered messages from Process 0 to Process 1</w:t>
+      </w:r>
+    </w:p>
+    <w:p>
+      <w:pPr>
+        <w:pStyle w:val="Listeavsnitt"/>
+        <w:numPr>
+          <w:ilvl w:val="1"/>
+          <w:numId w:val="20"/>
+        </w:numPr>
+        <w:rPr>
+          <w:rFonts w:ascii="Times New Roman" w:hAnsi="Times New Roman" w:cs="Times New Roman"/>
+          <w:lang w:val="en-GB" w:eastAsia="nb-NO"/>
+        </w:rPr>
+      </w:pPr>
+      <w:r>
+        <w:rPr>
+          <w:rFonts w:ascii="Times New Roman" w:hAnsi="Times New Roman" w:cs="Times New Roman"/>
+          <w:lang w:val="en-GB" w:eastAsia="nb-NO"/>
+        </w:rPr>
+        <w:t>Process 1 receives and prints each message sequentially</w:t>
+      </w:r>
+    </w:p>
+    <w:p>
+      <w:pPr>
+        <w:pStyle w:val="Listeavsnitt"/>
+        <w:numPr>
+          <w:ilvl w:val="1"/>
+          <w:numId w:val="20"/>
+        </w:numPr>
+        <w:rPr>
+          <w:rFonts w:ascii="Times New Roman" w:hAnsi="Times New Roman" w:cs="Times New Roman"/>
+          <w:lang w:val="en-GB" w:eastAsia="nb-NO"/>
+        </w:rPr>
+      </w:pPr>
+      <w:r>
+        <w:rPr>
+          <w:rFonts w:ascii="Times New Roman" w:hAnsi="Times New Roman" w:cs="Times New Roman"/>
+          <w:lang w:val="en-GB" w:eastAsia="nb-NO"/>
+        </w:rPr>
+        <w:t>Added section headers to show what each process is doing</w:t>
+      </w:r>
+    </w:p>
+    <w:p>
+      <w:pPr>
+        <w:pStyle w:val="Listeavsnitt"/>
+        <w:numPr>
+          <w:ilvl w:val="1"/>
+          <w:numId w:val="20"/>
+        </w:numPr>
+        <w:rPr>
+          <w:rFonts w:ascii="Times New Roman" w:hAnsi="Times New Roman" w:cs="Times New Roman"/>
+          <w:lang w:val="en-GB" w:eastAsia="nb-NO"/>
+        </w:rPr>
+      </w:pPr>
+      <w:r>
+        <w:rPr>
+          <w:rFonts w:ascii="Times New Roman" w:hAnsi="Times New Roman" w:cs="Times New Roman"/>
+          <w:lang w:val="en-GB" w:eastAsia="nb-NO"/>
+        </w:rPr>
+        <w:t>Added message numbering for clarity</w:t>
+      </w:r>
+    </w:p>
+    <w:p>
+      <w:pPr>
+        <w:pStyle w:val="Listeavsnitt"/>
+        <w:rPr>
+          <w:rFonts w:ascii="Times New Roman" w:hAnsi="Times New Roman" w:cs="Times New Roman"/>
+          <w:lang w:val="en-GB" w:eastAsia="nb-NO"/>
+        </w:rPr>
+      </w:pPr>
     </w:p>
     <w:p>
       <w:pPr>
@@ -437,6 +1177,29 @@
         </w:rPr>
         <w:t>Subtask 1:</w:t>
       </w:r>
+      <w:r>
+        <w:rPr>
+          <w:rFonts w:ascii="Times New Roman" w:hAnsi="Times New Roman" w:cs="Times New Roman"/>
+          <w:lang w:val="en-GB" w:eastAsia="nb-NO"/>
+        </w:rPr>
+        <w:t xml:space="preserve"> </w:t>
+      </w:r>
+      <w:proofErr w:type="spellStart"/>
+      <w:r>
+        <w:rPr>
+          <w:rFonts w:ascii="Times New Roman" w:hAnsi="Times New Roman" w:cs="Times New Roman"/>
+          <w:lang w:val="en-GB" w:eastAsia="nb-NO"/>
+        </w:rPr>
+        <w:t>Analyze</w:t>
+      </w:r>
+      <w:proofErr w:type="spellEnd"/>
+      <w:r>
+        <w:rPr>
+          <w:rFonts w:ascii="Times New Roman" w:hAnsi="Times New Roman" w:cs="Times New Roman"/>
+          <w:lang w:val="en-GB" w:eastAsia="nb-NO"/>
+        </w:rPr>
+        <w:t xml:space="preserve"> and explain code</w:t>
+      </w:r>
     </w:p>
     <w:p>
       <w:pPr>
@@ -451,6 +1214,91 @@
           <w:lang w:val="en-GB" w:eastAsia="nb-NO"/>
         </w:rPr>
         <w:t>Subtask 2:</w:t>
+      </w:r>
+      <w:r>
+        <w:rPr>
+          <w:rFonts w:ascii="Times New Roman" w:hAnsi="Times New Roman" w:cs="Times New Roman"/>
+          <w:lang w:val="en-GB" w:eastAsia="nb-NO"/>
+        </w:rPr>
+        <w:t xml:space="preserve"> Run code with </w:t>
+      </w:r>
+      <w:r>
+        <w:rPr>
+          <w:rFonts w:ascii="Times New Roman" w:hAnsi="Times New Roman" w:cs="Times New Roman"/>
+          <w:i/>
+          <w:iCs/>
+          <w:lang w:val="en-GB" w:eastAsia="nb-NO"/>
+        </w:rPr>
+        <w:t>N</w:t>
+      </w:r>
+      <w:r>
+        <w:rPr>
+          <w:rFonts w:ascii="Times New Roman" w:hAnsi="Times New Roman" w:cs="Times New Roman"/>
+          <w:lang w:val="en-GB" w:eastAsia="nb-NO"/>
+        </w:rPr>
+        <w:t xml:space="preserve"> = 1500 and processes is 1, </w:t>
+      </w:r>
+      <w:proofErr w:type="gramStart"/>
+      <w:r>
+        <w:rPr>
+          <w:rFonts w:ascii="Times New Roman" w:hAnsi="Times New Roman" w:cs="Times New Roman"/>
+          <w:lang w:val="en-GB" w:eastAsia="nb-NO"/>
+        </w:rPr>
+        <w:t>2,…</w:t>
+      </w:r>
+      <w:proofErr w:type="gramEnd"/>
+      <w:r>
+        <w:rPr>
+          <w:rFonts w:ascii="Times New Roman" w:hAnsi="Times New Roman" w:cs="Times New Roman"/>
+          <w:lang w:val="en-GB" w:eastAsia="nb-NO"/>
+        </w:rPr>
+        <w:t xml:space="preserve"> 10 – Screenshot</w:t>
+      </w:r>
+    </w:p>
+    <w:p>
+      <w:pPr>
+        <w:rPr>
+          <w:rFonts w:ascii="Times New Roman" w:hAnsi="Times New Roman" w:cs="Times New Roman"/>
+          <w:lang w:val="en-GB" w:eastAsia="nb-NO"/>
+        </w:rPr>
+      </w:pPr>
+      <w:r>
+        <w:rPr>
+          <w:rFonts w:ascii="Times New Roman" w:hAnsi="Times New Roman" w:cs="Times New Roman"/>
+          <w:lang w:val="en-GB" w:eastAsia="nb-NO"/>
+        </w:rPr>
+        <w:t>Subtask 3: Calculate speedup and discuss its value with the above setting</w:t>
+      </w:r>
+    </w:p>
+    <w:p>
+      <w:pPr>
+        <w:rPr>
+          <w:rFonts w:ascii="Times New Roman" w:hAnsi="Times New Roman" w:cs="Times New Roman"/>
+          <w:lang w:val="en-GB" w:eastAsia="nb-NO"/>
+        </w:rPr>
+      </w:pPr>
+      <w:r>
+        <w:rPr>
+          <w:rFonts w:ascii="Times New Roman" w:hAnsi="Times New Roman" w:cs="Times New Roman"/>
+          <w:lang w:val="en-GB" w:eastAsia="nb-NO"/>
+        </w:rPr>
+        <w:t xml:space="preserve">Subtask 4: What happens when </w:t>
+      </w:r>
+      <w:r>
+        <w:rPr>
+          <w:rFonts w:ascii="Times New Roman" w:hAnsi="Times New Roman" w:cs="Times New Roman"/>
+          <w:i/>
+          <w:iCs/>
+          <w:lang w:val="en-GB" w:eastAsia="nb-NO"/>
+        </w:rPr>
+        <w:t>N</w:t>
+      </w:r>
+      <w:r>
+        <w:rPr>
+          <w:rFonts w:ascii="Times New Roman" w:hAnsi="Times New Roman" w:cs="Times New Roman"/>
+          <w:lang w:val="en-GB" w:eastAsia="nb-NO"/>
+        </w:rPr>
+        <w:t xml:space="preserve"> = 10000 – Explain.</w:t>
       </w:r>
     </w:p>
     <w:p>
@@ -499,6 +1347,29 @@
         </w:rPr>
         <w:t>Subtask 1:</w:t>
       </w:r>
+      <w:r>
+        <w:rPr>
+          <w:rFonts w:ascii="Times New Roman" w:hAnsi="Times New Roman" w:cs="Times New Roman"/>
+          <w:lang w:val="en-GB" w:eastAsia="nb-NO"/>
+        </w:rPr>
+        <w:t xml:space="preserve"> Other </w:t>
+      </w:r>
+      <w:proofErr w:type="spellStart"/>
+      <w:r>
+        <w:rPr>
+          <w:rFonts w:ascii="Times New Roman" w:hAnsi="Times New Roman" w:cs="Times New Roman"/>
+          <w:lang w:val="en-GB" w:eastAsia="nb-NO"/>
+        </w:rPr>
+        <w:t>MPI</w:t>
+      </w:r>
+      <w:proofErr w:type="spellEnd"/>
+      <w:r>
+        <w:rPr>
+          <w:rFonts w:ascii="Times New Roman" w:hAnsi="Times New Roman" w:cs="Times New Roman"/>
+          <w:lang w:val="en-GB" w:eastAsia="nb-NO"/>
+        </w:rPr>
+        <w:t xml:space="preserve"> standards? Why or why not?</w:t>
+      </w:r>
     </w:p>
     <w:p>
       <w:pPr>
@@ -513,6 +1384,45 @@
           <w:lang w:val="en-GB" w:eastAsia="nb-NO"/>
         </w:rPr>
         <w:t>Subtask 2:</w:t>
+      </w:r>
+      <w:r>
+        <w:rPr>
+          <w:rFonts w:ascii="Times New Roman" w:hAnsi="Times New Roman" w:cs="Times New Roman"/>
+          <w:lang w:val="en-GB" w:eastAsia="nb-NO"/>
+        </w:rPr>
+        <w:t xml:space="preserve"> How </w:t>
+      </w:r>
+      <w:proofErr w:type="spellStart"/>
+      <w:r>
+        <w:rPr>
+          <w:rFonts w:ascii="Times New Roman" w:hAnsi="Times New Roman" w:cs="Times New Roman"/>
+          <w:lang w:val="en-GB" w:eastAsia="nb-NO"/>
+        </w:rPr>
+        <w:t>MPI</w:t>
+      </w:r>
+      <w:proofErr w:type="spellEnd"/>
+      <w:r>
+        <w:rPr>
+          <w:rFonts w:ascii="Times New Roman" w:hAnsi="Times New Roman" w:cs="Times New Roman"/>
+          <w:lang w:val="en-GB" w:eastAsia="nb-NO"/>
+        </w:rPr>
+        <w:t xml:space="preserve"> APIs are similar and different in different </w:t>
+      </w:r>
+      <w:proofErr w:type="spellStart"/>
+      <w:r>
+        <w:rPr>
+          <w:rFonts w:ascii="Times New Roman" w:hAnsi="Times New Roman" w:cs="Times New Roman"/>
+          <w:lang w:val="en-GB" w:eastAsia="nb-NO"/>
+        </w:rPr>
+        <w:t>MPI</w:t>
+      </w:r>
+      <w:proofErr w:type="spellEnd"/>
+      <w:r>
+        <w:rPr>
+          <w:rFonts w:ascii="Times New Roman" w:hAnsi="Times New Roman" w:cs="Times New Roman"/>
+          <w:lang w:val="en-GB" w:eastAsia="nb-NO"/>
+        </w:rPr>
+        <w:t xml:space="preserve"> implementations</w:t>
       </w:r>
     </w:p>
     <w:p>
@@ -551,8 +1461,8 @@
       </w:pPr>
     </w:p>
     <w:sectPr>
-      <w:headerReference w:type="even" r:id="rId7"/>
-      <w:headerReference w:type="default" r:id="rId8"/>
+      <w:headerReference w:type="even" r:id="rId12"/>
+      <w:headerReference w:type="default" r:id="rId13"/>
       <w:pgSz w:w="11906" w:h="16838"/>
       <w:pgMar w:top="1417" w:right="1417" w:bottom="1417" w:left="1417" w:header="708" w:footer="708" w:gutter="0"/>
       <w:cols w:space="708"/>
@@ -625,11 +1535,6 @@
         <w:docPartUnique/>
       </w:docPartObj>
     </w:sdtPr>
-    <w:sdtEndPr>
-      <w:rPr>
-        <w:rStyle w:val="Sidetall"/>
-      </w:rPr>
-    </w:sdtEndPr>
     <w:sdtContent>
       <w:p>
         <w:pPr>
@@ -688,11 +1593,6 @@
         <w:docPartUnique/>
       </w:docPartObj>
     </w:sdtPr>
-    <w:sdtEndPr>
-      <w:rPr>
-        <w:rStyle w:val="Sidetall"/>
-      </w:rPr>
-    </w:sdtEndPr>
     <w:sdtContent>
       <w:p>
         <w:pPr>
@@ -1088,6 +1988,118 @@
     </w:lvl>
   </w:abstractNum>
   <w:abstractNum w:abstractNumId="3" w15:restartNumberingAfterBreak="0">
+    <w:nsid w:val="16EB7549"/>
+    <w:multiLevelType w:val="hybridMultilevel"/>
+    <w:tmpl w:val="DC6225C0"/>
+    <w:lvl w:ilvl="0" w:tplc="01F2EBF0">
+      <w:numFmt w:val="bullet"/>
+      <w:lvlText w:val="-"/>
+      <w:lvlJc w:val="left"/>
+      <w:pPr>
+        <w:ind w:left="1060" w:hanging="360"/>
+      </w:pPr>
+      <w:rPr>
+        <w:rFonts w:ascii="Times New Roman" w:eastAsiaTheme="minorHAnsi" w:hAnsi="Times New Roman" w:cs="Times New Roman" w:hint="default"/>
+      </w:rPr>
+    </w:lvl>
+    <w:lvl w:ilvl="1" w:tplc="04140003" w:tentative="1">
+      <w:start w:val="1"/>
+      <w:numFmt w:val="bullet"/>
+      <w:lvlText w:val="o"/>
+      <w:lvlJc w:val="left"/>
+      <w:pPr>
+        <w:ind w:left="1780" w:hanging="360"/>
+      </w:pPr>
+      <w:rPr>
+        <w:rFonts w:ascii="Courier New" w:hAnsi="Courier New" w:cs="Courier New" w:hint="default"/>
+      </w:rPr>
+    </w:lvl>
+    <w:lvl w:ilvl="2" w:tplc="04140005" w:tentative="1">
+      <w:start w:val="1"/>
+      <w:numFmt w:val="bullet"/>
+      <w:lvlText w:val=""/>
+      <w:lvlJc w:val="left"/>
+      <w:pPr>
+        <w:ind w:left="2500" w:hanging="360"/>
+      </w:pPr>
+      <w:rPr>
+        <w:rFonts w:ascii="Wingdings" w:hAnsi="Wingdings" w:hint="default"/>
+      </w:rPr>
+    </w:lvl>
+    <w:lvl w:ilvl="3" w:tplc="04140001" w:tentative="1">
+      <w:start w:val="1"/>
+      <w:numFmt w:val="bullet"/>
+      <w:lvlText w:val=""/>
+      <w:lvlJc w:val="left"/>
+      <w:pPr>
+        <w:ind w:left="3220" w:hanging="360"/>
+      </w:pPr>
+      <w:rPr>
+        <w:rFonts w:ascii="Symbol" w:hAnsi="Symbol" w:hint="default"/>
+      </w:rPr>
+    </w:lvl>
+    <w:lvl w:ilvl="4" w:tplc="04140003" w:tentative="1">
+      <w:start w:val="1"/>
+      <w:numFmt w:val="bullet"/>
+      <w:lvlText w:val="o"/>
+      <w:lvlJc w:val="left"/>
+      <w:pPr>
+        <w:ind w:left="3940" w:hanging="360"/>
+      </w:pPr>
+      <w:rPr>
+        <w:rFonts w:ascii="Courier New" w:hAnsi="Courier New" w:cs="Courier New" w:hint="default"/>
+      </w:rPr>
+    </w:lvl>
+    <w:lvl w:ilvl="5" w:tplc="04140005" w:tentative="1">
+      <w:start w:val="1"/>
+      <w:numFmt w:val="bullet"/>
+      <w:lvlText w:val=""/>
+      <w:lvlJc w:val="left"/>
+      <w:pPr>
+        <w:ind w:left="4660" w:hanging="360"/>
+      </w:pPr>
+      <w:rPr>
+        <w:rFonts w:ascii="Wingdings" w:hAnsi="Wingdings" w:hint="default"/>
+      </w:rPr>
+    </w:lvl>
+    <w:lvl w:ilvl="6" w:tplc="04140001" w:tentative="1">
+      <w:start w:val="1"/>
+      <w:numFmt w:val="bullet"/>
+      <w:lvlText w:val=""/>
+      <w:lvlJc w:val="left"/>
+      <w:pPr>
+        <w:ind w:left="5380" w:hanging="360"/>
+      </w:pPr>
+      <w:rPr>
+        <w:rFonts w:ascii="Symbol" w:hAnsi="Symbol" w:hint="default"/>
+      </w:rPr>
+    </w:lvl>
+    <w:lvl w:ilvl="7" w:tplc="04140003" w:tentative="1">
+      <w:start w:val="1"/>
+      <w:numFmt w:val="bullet"/>
+      <w:lvlText w:val="o"/>
+      <w:lvlJc w:val="left"/>
+      <w:pPr>
+        <w:ind w:left="6100" w:hanging="360"/>
+      </w:pPr>
+      <w:rPr>
+        <w:rFonts w:ascii="Courier New" w:hAnsi="Courier New" w:cs="Courier New" w:hint="default"/>
+      </w:rPr>
+    </w:lvl>
+    <w:lvl w:ilvl="8" w:tplc="04140005" w:tentative="1">
+      <w:start w:val="1"/>
+      <w:numFmt w:val="bullet"/>
+      <w:lvlText w:val=""/>
+      <w:lvlJc w:val="left"/>
+      <w:pPr>
+        <w:ind w:left="6820" w:hanging="360"/>
+      </w:pPr>
+      <w:rPr>
+        <w:rFonts w:ascii="Wingdings" w:hAnsi="Wingdings" w:hint="default"/>
+      </w:rPr>
+    </w:lvl>
+  </w:abstractNum>
+  <w:abstractNum w:abstractNumId="4" w15:restartNumberingAfterBreak="0">
     <w:nsid w:val="1D061BB9"/>
     <w:multiLevelType w:val="hybridMultilevel"/>
     <w:tmpl w:val="38E2C3F8"/>
@@ -1199,7 +2211,7 @@
       </w:rPr>
     </w:lvl>
   </w:abstractNum>
-  <w:abstractNum w:abstractNumId="4" w15:restartNumberingAfterBreak="0">
+  <w:abstractNum w:abstractNumId="5" w15:restartNumberingAfterBreak="0">
     <w:nsid w:val="24A75890"/>
     <w:multiLevelType w:val="multilevel"/>
     <w:tmpl w:val="E4BA41EC"/>
@@ -1313,7 +2325,7 @@
       </w:rPr>
     </w:lvl>
   </w:abstractNum>
-  <w:abstractNum w:abstractNumId="5" w15:restartNumberingAfterBreak="0">
+  <w:abstractNum w:abstractNumId="6" w15:restartNumberingAfterBreak="0">
     <w:nsid w:val="2CF60C80"/>
     <w:multiLevelType w:val="hybridMultilevel"/>
     <w:tmpl w:val="AA4004E0"/>
@@ -1425,7 +2437,7 @@
       </w:rPr>
     </w:lvl>
   </w:abstractNum>
-  <w:abstractNum w:abstractNumId="6" w15:restartNumberingAfterBreak="0">
+  <w:abstractNum w:abstractNumId="7" w15:restartNumberingAfterBreak="0">
     <w:nsid w:val="2F563318"/>
     <w:multiLevelType w:val="multilevel"/>
     <w:tmpl w:val="95B6D4F4"/>
@@ -1539,7 +2551,7 @@
       </w:pPr>
     </w:lvl>
   </w:abstractNum>
-  <w:abstractNum w:abstractNumId="7" w15:restartNumberingAfterBreak="0">
+  <w:abstractNum w:abstractNumId="8" w15:restartNumberingAfterBreak="0">
     <w:nsid w:val="33F33B05"/>
     <w:multiLevelType w:val="multilevel"/>
     <w:tmpl w:val="00BA5B72"/>
@@ -1652,7 +2664,119 @@
       </w:rPr>
     </w:lvl>
   </w:abstractNum>
-  <w:abstractNum w:abstractNumId="8" w15:restartNumberingAfterBreak="0">
+  <w:abstractNum w:abstractNumId="9" w15:restartNumberingAfterBreak="0">
+    <w:nsid w:val="4AA3097C"/>
+    <w:multiLevelType w:val="hybridMultilevel"/>
+    <w:tmpl w:val="38009FD8"/>
+    <w:lvl w:ilvl="0" w:tplc="C2E6A9D0">
+      <w:numFmt w:val="bullet"/>
+      <w:lvlText w:val="-"/>
+      <w:lvlJc w:val="left"/>
+      <w:pPr>
+        <w:ind w:left="720" w:hanging="360"/>
+      </w:pPr>
+      <w:rPr>
+        <w:rFonts w:ascii="Times New Roman" w:eastAsiaTheme="minorHAnsi" w:hAnsi="Times New Roman" w:cs="Times New Roman" w:hint="default"/>
+      </w:rPr>
+    </w:lvl>
+    <w:lvl w:ilvl="1" w:tplc="04140003" w:tentative="1">
+      <w:start w:val="1"/>
+      <w:numFmt w:val="bullet"/>
+      <w:lvlText w:val="o"/>
+      <w:lvlJc w:val="left"/>
+      <w:pPr>
+        <w:ind w:left="1440" w:hanging="360"/>
+      </w:pPr>
+      <w:rPr>
+        <w:rFonts w:ascii="Courier New" w:hAnsi="Courier New" w:cs="Courier New" w:hint="default"/>
+      </w:rPr>
+    </w:lvl>
+    <w:lvl w:ilvl="2" w:tplc="04140005" w:tentative="1">
+      <w:start w:val="1"/>
+      <w:numFmt w:val="bullet"/>
+      <w:lvlText w:val=""/>
+      <w:lvlJc w:val="left"/>
+      <w:pPr>
+        <w:ind w:left="2160" w:hanging="360"/>
+      </w:pPr>
+      <w:rPr>
+        <w:rFonts w:ascii="Wingdings" w:hAnsi="Wingdings" w:hint="default"/>
+      </w:rPr>
+    </w:lvl>
+    <w:lvl w:ilvl="3" w:tplc="04140001" w:tentative="1">
+      <w:start w:val="1"/>
+      <w:numFmt w:val="bullet"/>
+      <w:lvlText w:val=""/>
+      <w:lvlJc w:val="left"/>
+      <w:pPr>
+        <w:ind w:left="2880" w:hanging="360"/>
+      </w:pPr>
+      <w:rPr>
+        <w:rFonts w:ascii="Symbol" w:hAnsi="Symbol" w:hint="default"/>
+      </w:rPr>
+    </w:lvl>
+    <w:lvl w:ilvl="4" w:tplc="04140003" w:tentative="1">
+      <w:start w:val="1"/>
+      <w:numFmt w:val="bullet"/>
+      <w:lvlText w:val="o"/>
+      <w:lvlJc w:val="left"/>
+      <w:pPr>
+        <w:ind w:left="3600" w:hanging="360"/>
+      </w:pPr>
+      <w:rPr>
+        <w:rFonts w:ascii="Courier New" w:hAnsi="Courier New" w:cs="Courier New" w:hint="default"/>
+      </w:rPr>
+    </w:lvl>
+    <w:lvl w:ilvl="5" w:tplc="04140005" w:tentative="1">
+      <w:start w:val="1"/>
+      <w:numFmt w:val="bullet"/>
+      <w:lvlText w:val=""/>
+      <w:lvlJc w:val="left"/>
+      <w:pPr>
+        <w:ind w:left="4320" w:hanging="360"/>
+      </w:pPr>
+      <w:rPr>
+        <w:rFonts w:ascii="Wingdings" w:hAnsi="Wingdings" w:hint="default"/>
+      </w:rPr>
+    </w:lvl>
+    <w:lvl w:ilvl="6" w:tplc="04140001" w:tentative="1">
+      <w:start w:val="1"/>
+      <w:numFmt w:val="bullet"/>
+      <w:lvlText w:val=""/>
+      <w:lvlJc w:val="left"/>
+      <w:pPr>
+        <w:ind w:left="5040" w:hanging="360"/>
+      </w:pPr>
+      <w:rPr>
+        <w:rFonts w:ascii="Symbol" w:hAnsi="Symbol" w:hint="default"/>
+      </w:rPr>
+    </w:lvl>
+    <w:lvl w:ilvl="7" w:tplc="04140003" w:tentative="1">
+      <w:start w:val="1"/>
+      <w:numFmt w:val="bullet"/>
+      <w:lvlText w:val="o"/>
+      <w:lvlJc w:val="left"/>
+      <w:pPr>
+        <w:ind w:left="5760" w:hanging="360"/>
+      </w:pPr>
+      <w:rPr>
+        <w:rFonts w:ascii="Courier New" w:hAnsi="Courier New" w:cs="Courier New" w:hint="default"/>
+      </w:rPr>
+    </w:lvl>
+    <w:lvl w:ilvl="8" w:tplc="04140005" w:tentative="1">
+      <w:start w:val="1"/>
+      <w:numFmt w:val="bullet"/>
+      <w:lvlText w:val=""/>
+      <w:lvlJc w:val="left"/>
+      <w:pPr>
+        <w:ind w:left="6480" w:hanging="360"/>
+      </w:pPr>
+      <w:rPr>
+        <w:rFonts w:ascii="Wingdings" w:hAnsi="Wingdings" w:hint="default"/>
+      </w:rPr>
+    </w:lvl>
+  </w:abstractNum>
+  <w:abstractNum w:abstractNumId="10" w15:restartNumberingAfterBreak="0">
     <w:nsid w:val="54451AB2"/>
     <w:multiLevelType w:val="multilevel"/>
     <w:tmpl w:val="4F223346"/>
@@ -1765,7 +2889,7 @@
       </w:rPr>
     </w:lvl>
   </w:abstractNum>
-  <w:abstractNum w:abstractNumId="9" w15:restartNumberingAfterBreak="0">
+  <w:abstractNum w:abstractNumId="11" w15:restartNumberingAfterBreak="0">
     <w:nsid w:val="54FA350F"/>
     <w:multiLevelType w:val="multilevel"/>
     <w:tmpl w:val="8100538E"/>
@@ -1878,7 +3002,7 @@
       </w:rPr>
     </w:lvl>
   </w:abstractNum>
-  <w:abstractNum w:abstractNumId="10" w15:restartNumberingAfterBreak="0">
+  <w:abstractNum w:abstractNumId="12" w15:restartNumberingAfterBreak="0">
     <w:nsid w:val="58A4597A"/>
     <w:multiLevelType w:val="hybridMultilevel"/>
     <w:tmpl w:val="55D8B7F2"/>
@@ -1990,7 +3114,119 @@
       </w:rPr>
     </w:lvl>
   </w:abstractNum>
-  <w:abstractNum w:abstractNumId="11" w15:restartNumberingAfterBreak="0">
+  <w:abstractNum w:abstractNumId="13" w15:restartNumberingAfterBreak="0">
+    <w:nsid w:val="5AD27183"/>
+    <w:multiLevelType w:val="hybridMultilevel"/>
+    <w:tmpl w:val="BB58D052"/>
+    <w:lvl w:ilvl="0" w:tplc="F454ED00">
+      <w:numFmt w:val="bullet"/>
+      <w:lvlText w:val="-"/>
+      <w:lvlJc w:val="left"/>
+      <w:pPr>
+        <w:ind w:left="720" w:hanging="360"/>
+      </w:pPr>
+      <w:rPr>
+        <w:rFonts w:ascii="Times New Roman" w:eastAsiaTheme="minorHAnsi" w:hAnsi="Times New Roman" w:cs="Times New Roman" w:hint="default"/>
+      </w:rPr>
+    </w:lvl>
+    <w:lvl w:ilvl="1" w:tplc="04140003">
+      <w:start w:val="1"/>
+      <w:numFmt w:val="bullet"/>
+      <w:lvlText w:val="o"/>
+      <w:lvlJc w:val="left"/>
+      <w:pPr>
+        <w:ind w:left="1440" w:hanging="360"/>
+      </w:pPr>
+      <w:rPr>
+        <w:rFonts w:ascii="Courier New" w:hAnsi="Courier New" w:cs="Courier New" w:hint="default"/>
+      </w:rPr>
+    </w:lvl>
+    <w:lvl w:ilvl="2" w:tplc="04140005" w:tentative="1">
+      <w:start w:val="1"/>
+      <w:numFmt w:val="bullet"/>
+      <w:lvlText w:val=""/>
+      <w:lvlJc w:val="left"/>
+      <w:pPr>
+        <w:ind w:left="2160" w:hanging="360"/>
+      </w:pPr>
+      <w:rPr>
+        <w:rFonts w:ascii="Wingdings" w:hAnsi="Wingdings" w:hint="default"/>
+      </w:rPr>
+    </w:lvl>
+    <w:lvl w:ilvl="3" w:tplc="04140001" w:tentative="1">
+      <w:start w:val="1"/>
+      <w:numFmt w:val="bullet"/>
+      <w:lvlText w:val=""/>
+      <w:lvlJc w:val="left"/>
+      <w:pPr>
+        <w:ind w:left="2880" w:hanging="360"/>
+      </w:pPr>
+      <w:rPr>
+        <w:rFonts w:ascii="Symbol" w:hAnsi="Symbol" w:hint="default"/>
+      </w:rPr>
+    </w:lvl>
+    <w:lvl w:ilvl="4" w:tplc="04140003" w:tentative="1">
+      <w:start w:val="1"/>
+      <w:numFmt w:val="bullet"/>
+      <w:lvlText w:val="o"/>
+      <w:lvlJc w:val="left"/>
+      <w:pPr>
+        <w:ind w:left="3600" w:hanging="360"/>
+      </w:pPr>
+      <w:rPr>
+        <w:rFonts w:ascii="Courier New" w:hAnsi="Courier New" w:cs="Courier New" w:hint="default"/>
+      </w:rPr>
+    </w:lvl>
+    <w:lvl w:ilvl="5" w:tplc="04140005" w:tentative="1">
+      <w:start w:val="1"/>
+      <w:numFmt w:val="bullet"/>
+      <w:lvlText w:val=""/>
+      <w:lvlJc w:val="left"/>
+      <w:pPr>
+        <w:ind w:left="4320" w:hanging="360"/>
+      </w:pPr>
+      <w:rPr>
+        <w:rFonts w:ascii="Wingdings" w:hAnsi="Wingdings" w:hint="default"/>
+      </w:rPr>
+    </w:lvl>
+    <w:lvl w:ilvl="6" w:tplc="04140001" w:tentative="1">
+      <w:start w:val="1"/>
+      <w:numFmt w:val="bullet"/>
+      <w:lvlText w:val=""/>
+      <w:lvlJc w:val="left"/>
+      <w:pPr>
+        <w:ind w:left="5040" w:hanging="360"/>
+      </w:pPr>
+      <w:rPr>
+        <w:rFonts w:ascii="Symbol" w:hAnsi="Symbol" w:hint="default"/>
+      </w:rPr>
+    </w:lvl>
+    <w:lvl w:ilvl="7" w:tplc="04140003" w:tentative="1">
+      <w:start w:val="1"/>
+      <w:numFmt w:val="bullet"/>
+      <w:lvlText w:val="o"/>
+      <w:lvlJc w:val="left"/>
+      <w:pPr>
+        <w:ind w:left="5760" w:hanging="360"/>
+      </w:pPr>
+      <w:rPr>
+        <w:rFonts w:ascii="Courier New" w:hAnsi="Courier New" w:cs="Courier New" w:hint="default"/>
+      </w:rPr>
+    </w:lvl>
+    <w:lvl w:ilvl="8" w:tplc="04140005" w:tentative="1">
+      <w:start w:val="1"/>
+      <w:numFmt w:val="bullet"/>
+      <w:lvlText w:val=""/>
+      <w:lvlJc w:val="left"/>
+      <w:pPr>
+        <w:ind w:left="6480" w:hanging="360"/>
+      </w:pPr>
+      <w:rPr>
+        <w:rFonts w:ascii="Wingdings" w:hAnsi="Wingdings" w:hint="default"/>
+      </w:rPr>
+    </w:lvl>
+  </w:abstractNum>
+  <w:abstractNum w:abstractNumId="14" w15:restartNumberingAfterBreak="0">
     <w:nsid w:val="65692C21"/>
     <w:multiLevelType w:val="multilevel"/>
     <w:tmpl w:val="6DBC67E4"/>
@@ -2103,7 +3339,7 @@
       </w:rPr>
     </w:lvl>
   </w:abstractNum>
-  <w:abstractNum w:abstractNumId="12" w15:restartNumberingAfterBreak="0">
+  <w:abstractNum w:abstractNumId="15" w15:restartNumberingAfterBreak="0">
     <w:nsid w:val="7E8633CB"/>
     <w:multiLevelType w:val="multilevel"/>
     <w:tmpl w:val="D3F27AD2"/>
@@ -2217,25 +3453,25 @@
     </w:lvl>
   </w:abstractNum>
   <w:num w:numId="1" w16cid:durableId="1442652110">
-    <w:abstractNumId w:val="12"/>
+    <w:abstractNumId w:val="15"/>
   </w:num>
   <w:num w:numId="2" w16cid:durableId="1060447681">
-    <w:abstractNumId w:val="7"/>
+    <w:abstractNumId w:val="8"/>
   </w:num>
   <w:num w:numId="3" w16cid:durableId="1708601671">
-    <w:abstractNumId w:val="7"/>
+    <w:abstractNumId w:val="8"/>
   </w:num>
   <w:num w:numId="4" w16cid:durableId="1803303132">
-    <w:abstractNumId w:val="11"/>
+    <w:abstractNumId w:val="14"/>
   </w:num>
   <w:num w:numId="5" w16cid:durableId="1697074110">
-    <w:abstractNumId w:val="8"/>
+    <w:abstractNumId w:val="10"/>
   </w:num>
   <w:num w:numId="6" w16cid:durableId="1528252287">
-    <w:abstractNumId w:val="4"/>
+    <w:abstractNumId w:val="5"/>
   </w:num>
   <w:num w:numId="7" w16cid:durableId="105662357">
-    <w:abstractNumId w:val="4"/>
+    <w:abstractNumId w:val="5"/>
   </w:num>
   <w:num w:numId="8" w16cid:durableId="1629508395">
     <w:abstractNumId w:val="2"/>
@@ -2271,28 +3507,37 @@
     </w:lvlOverride>
   </w:num>
   <w:num w:numId="10" w16cid:durableId="1226069016">
-    <w:abstractNumId w:val="9"/>
+    <w:abstractNumId w:val="11"/>
   </w:num>
   <w:num w:numId="11" w16cid:durableId="126748389">
-    <w:abstractNumId w:val="9"/>
+    <w:abstractNumId w:val="11"/>
   </w:num>
   <w:num w:numId="12" w16cid:durableId="976647430">
     <w:abstractNumId w:val="0"/>
   </w:num>
   <w:num w:numId="13" w16cid:durableId="653877564">
-    <w:abstractNumId w:val="6"/>
+    <w:abstractNumId w:val="7"/>
   </w:num>
   <w:num w:numId="14" w16cid:durableId="2062241591">
-    <w:abstractNumId w:val="10"/>
+    <w:abstractNumId w:val="12"/>
   </w:num>
   <w:num w:numId="15" w16cid:durableId="1838572655">
-    <w:abstractNumId w:val="5"/>
+    <w:abstractNumId w:val="6"/>
   </w:num>
   <w:num w:numId="16" w16cid:durableId="873347180">
     <w:abstractNumId w:val="1"/>
   </w:num>
   <w:num w:numId="17" w16cid:durableId="600188363">
+    <w:abstractNumId w:val="4"/>
+  </w:num>
+  <w:num w:numId="18" w16cid:durableId="1992982122">
     <w:abstractNumId w:val="3"/>
+  </w:num>
+  <w:num w:numId="19" w16cid:durableId="802889912">
+    <w:abstractNumId w:val="9"/>
+  </w:num>
+  <w:num w:numId="20" w16cid:durableId="1118180385">
+    <w:abstractNumId w:val="13"/>
   </w:num>
 </w:numbering>
 </file>
@@ -2914,6 +4159,7 @@
   <w:style w:type="character" w:default="1" w:styleId="Standardskriftforavsnitt">
     <w:name w:val="Default Paragraph Font"/>
     <w:uiPriority w:val="1"/>
+    <w:semiHidden/>
     <w:unhideWhenUsed/>
   </w:style>
   <w:style w:type="table" w:default="1" w:styleId="Vanligtabell">

</xml_diff>